<commit_message>
Update report metadata: Guided by Prof. Madhuri Kethari and title to Formative Assessment 2 (FA2)
</commit_message>
<xml_diff>
--- a/outputs/reports/PCCoE_BDA_Mini_Project_Report.docx
+++ b/outputs/reports/PCCoE_BDA_Mini_Project_Report.docx
@@ -151,7 +151,7 @@
           <w:b w:val="0"/>
           <w:sz w:val="22"/>
         </w:rPr>
-        <w:t>A Project Report</w:t>
+        <w:t>A Formative Assessment 2 (FA2) Report</w:t>
       </w:r>
     </w:p>
     <w:p>
@@ -249,7 +249,7 @@
           <w:b/>
           <w:sz w:val="22"/>
         </w:rPr>
-        <w:t>Guided by: Dr. Jaya Dewan</w:t>
+        <w:t>Guided by: Prof. Madhuri Kethari</w:t>
       </w:r>
     </w:p>
     <w:p>
@@ -2830,7 +2830,7 @@
         <w:color w:val="808080"/>
         <w:sz w:val="17"/>
       </w:rPr>
-      <w:t>BDA Mini Project · Zomato Bangalore Restaurant Analytics Using Apache Spark</w:t>
+      <w:t>BDA Formative Assessment 2 · Zomato Bangalore Restaurant Analytics Using Apache Spark</w:t>
     </w:r>
   </w:p>
 </w:ftr>

</xml_diff>